<commit_message>
docs: add Report 1 correctly following the exact template and structure of Report 2, update ordering
</commit_message>
<xml_diff>
--- a/docs/reports/report1-2026-08-19/latex/report1.docx
+++ b/docs/reports/report1-2026-08-19/latex/report1.docx
@@ -272,7 +272,7 @@
       </w:r>
     </w:p>
     <w:bookmarkEnd w:id="12"/>
-    <w:bookmarkStart w:id="14" w:name="mejoras-en-la-configuración"/>
+    <w:bookmarkStart w:id="13" w:name="mejoras-en-la-configuración"/>
     <w:p>
       <w:pPr>
         <w:pStyle w:val="Heading2"/>
@@ -293,21 +293,22 @@
         <w:t xml:space="preserve">Pendiente por implementar / Falta de información para esta etapa.</w:t>
       </w:r>
     </w:p>
-    <w:bookmarkStart w:id="13" w:name="tab:backend-changes"/>
-    <w:p>
-      <w:pPr>
-        <w:pStyle w:val="TableCaption"/>
-      </w:pPr>
-      <w:r>
-        <w:t xml:space="preserve">Resumen de cambios en el servidor (Backend)</w:t>
+    <w:bookmarkEnd w:id="13"/>
+    <w:bookmarkStart w:id="14" w:name="resumen-de-cambios-backend"/>
+    <w:p>
+      <w:pPr>
+        <w:pStyle w:val="Heading2"/>
+      </w:pPr>
+      <w:r>
+        <w:t xml:space="preserve">Resumen de cambios — Backend</w:t>
       </w:r>
     </w:p>
     <w:tbl>
       <w:tblPr>
         <w:tblStyle w:val="Table"/>
-        <w:tblW w:type="auto" w:w="0"/>
+        <w:tblW w:type="pct" w:w="5000"/>
+        <w:tblLayout w:type="fixed"/>
         <w:tblLook w:firstRow="1" w:lastRow="0" w:firstColumn="0" w:lastColumn="0" w:noHBand="0" w:noVBand="0" w:val="0020"/>
-        <w:tblCaption w:val="Resumen de cambios en el servidor (Backend)"/>
       </w:tblPr>
       <w:tblGrid>
         <w:gridCol w:w="3960"/>
@@ -322,13 +323,8 @@
           <w:p>
             <w:pPr>
               <w:pStyle w:val="Compact"/>
-              <w:jc w:val="left"/>
             </w:pPr>
             <w:r>
-              <w:rPr>
-                <w:b/>
-                <w:bCs/>
-              </w:rPr>
               <w:t xml:space="preserve">Área</w:t>
             </w:r>
           </w:p>
@@ -338,7 +334,6 @@
           <w:p>
             <w:pPr>
               <w:pStyle w:val="Compact"/>
-              <w:jc w:val="left"/>
             </w:pPr>
             <w:r>
               <w:t xml:space="preserve">Descripción del cambio</w:t>
@@ -352,13 +347,8 @@
           <w:p>
             <w:pPr>
               <w:pStyle w:val="Compact"/>
-              <w:jc w:val="left"/>
             </w:pPr>
             <w:r>
-              <w:rPr>
-                <w:b/>
-                <w:bCs/>
-              </w:rPr>
               <w:t xml:space="preserve">Seguridad</w:t>
             </w:r>
           </w:p>
@@ -368,7 +358,6 @@
           <w:p>
             <w:pPr>
               <w:pStyle w:val="Compact"/>
-              <w:jc w:val="left"/>
             </w:pPr>
             <w:r>
               <w:t xml:space="preserve">Definición de separación estricta entre perfiles de Administrador y Estudiante.</w:t>
@@ -382,13 +371,8 @@
           <w:p>
             <w:pPr>
               <w:pStyle w:val="Compact"/>
-              <w:jc w:val="left"/>
             </w:pPr>
             <w:r>
-              <w:rPr>
-                <w:b/>
-                <w:bCs/>
-              </w:rPr>
               <w:t xml:space="preserve">Infraestructura</w:t>
             </w:r>
           </w:p>
@@ -398,7 +382,6 @@
           <w:p>
             <w:pPr>
               <w:pStyle w:val="Compact"/>
-              <w:jc w:val="left"/>
             </w:pPr>
             <w:r>
               <w:t xml:space="preserve">Validación del almacenamiento en MongoDB (500 MB) como escalable y suficiente.</w:t>
@@ -407,7 +390,6 @@
         </w:tc>
       </w:tr>
     </w:tbl>
-    <w:bookmarkEnd w:id="13"/>
     <w:bookmarkEnd w:id="14"/>
     <w:bookmarkEnd w:id="15"/>
     <w:bookmarkStart w:id="24" w:name="cambios-en-la-aplicación-web-frontend"/>
@@ -481,13 +463,13 @@
       </w:r>
     </w:p>
     <w:bookmarkEnd w:id="18"/>
-    <w:bookmarkStart w:id="19" w:name="vista-de-lista-de-estudiantes"/>
+    <w:bookmarkStart w:id="19" w:name="lista-de-estudiantes"/>
     <w:p>
       <w:pPr>
         <w:pStyle w:val="Heading2"/>
       </w:pPr>
       <w:r>
-        <w:t xml:space="preserve">Vista de Lista de Estudiantes</w:t>
+        <w:t xml:space="preserve">Lista de Estudiantes</w:t>
       </w:r>
     </w:p>
     <w:p>
@@ -521,13 +503,13 @@
       </w:r>
     </w:p>
     <w:bookmarkEnd w:id="20"/>
-    <w:bookmarkStart w:id="21" w:name="panel-del-estudiante-vista-de-inicio"/>
+    <w:bookmarkStart w:id="21" w:name="panel-del-estudiante"/>
     <w:p>
       <w:pPr>
         <w:pStyle w:val="Heading2"/>
       </w:pPr>
       <w:r>
-        <w:t xml:space="preserve">Panel del Estudiante (Vista de inicio)</w:t>
+        <w:t xml:space="preserve">Panel del Estudiante</w:t>
       </w:r>
     </w:p>
     <w:p>
@@ -543,7 +525,7 @@
       </w:r>
     </w:p>
     <w:bookmarkEnd w:id="21"/>
-    <w:bookmarkStart w:id="23" w:name="carga-de-archivos"/>
+    <w:bookmarkStart w:id="22" w:name="carga-de-archivos"/>
     <w:p>
       <w:pPr>
         <w:pStyle w:val="Heading2"/>
@@ -560,21 +542,22 @@
         <w:t xml:space="preserve">Se solicitó la capacidad de automatizar la generación de constancias de término o cartas de participación desde el sistema de forma digital.</w:t>
       </w:r>
     </w:p>
-    <w:bookmarkStart w:id="22" w:name="tab:frontend-changes"/>
-    <w:p>
-      <w:pPr>
-        <w:pStyle w:val="TableCaption"/>
-      </w:pPr>
-      <w:r>
-        <w:t xml:space="preserve">Resumen de cambios en la aplicación web (Frontend)</w:t>
+    <w:bookmarkEnd w:id="22"/>
+    <w:bookmarkStart w:id="23" w:name="resumen-de-cambios-frontend"/>
+    <w:p>
+      <w:pPr>
+        <w:pStyle w:val="Heading2"/>
+      </w:pPr>
+      <w:r>
+        <w:t xml:space="preserve">Resumen de cambios — Frontend</w:t>
       </w:r>
     </w:p>
     <w:tbl>
       <w:tblPr>
         <w:tblStyle w:val="Table"/>
-        <w:tblW w:type="auto" w:w="0"/>
+        <w:tblW w:type="pct" w:w="5000"/>
+        <w:tblLayout w:type="fixed"/>
         <w:tblLook w:firstRow="1" w:lastRow="0" w:firstColumn="0" w:lastColumn="0" w:noHBand="0" w:noVBand="0" w:val="0020"/>
-        <w:tblCaption w:val="Resumen de cambios en la aplicación web (Frontend)"/>
       </w:tblPr>
       <w:tblGrid>
         <w:gridCol w:w="3960"/>
@@ -589,13 +572,8 @@
           <w:p>
             <w:pPr>
               <w:pStyle w:val="Compact"/>
-              <w:jc w:val="left"/>
             </w:pPr>
             <w:r>
-              <w:rPr>
-                <w:b/>
-                <w:bCs/>
-              </w:rPr>
               <w:t xml:space="preserve">Área</w:t>
             </w:r>
           </w:p>
@@ -605,7 +583,6 @@
           <w:p>
             <w:pPr>
               <w:pStyle w:val="Compact"/>
-              <w:jc w:val="left"/>
             </w:pPr>
             <w:r>
               <w:t xml:space="preserve">Descripción del cambio</w:t>
@@ -619,13 +596,8 @@
           <w:p>
             <w:pPr>
               <w:pStyle w:val="Compact"/>
-              <w:jc w:val="left"/>
             </w:pPr>
             <w:r>
-              <w:rPr>
-                <w:b/>
-                <w:bCs/>
-              </w:rPr>
               <w:t xml:space="preserve">Prototipo</w:t>
             </w:r>
           </w:p>
@@ -635,7 +607,6 @@
           <w:p>
             <w:pPr>
               <w:pStyle w:val="Compact"/>
-              <w:jc w:val="left"/>
             </w:pPr>
             <w:r>
               <w:t xml:space="preserve">Presentación y validación del diseño visual inicial con ABAQ Querétaro.</w:t>
@@ -649,13 +620,8 @@
           <w:p>
             <w:pPr>
               <w:pStyle w:val="Compact"/>
-              <w:jc w:val="left"/>
             </w:pPr>
             <w:r>
-              <w:rPr>
-                <w:b/>
-                <w:bCs/>
-              </w:rPr>
               <w:t xml:space="preserve">Requerimientos</w:t>
             </w:r>
           </w:p>
@@ -665,7 +631,6 @@
           <w:p>
             <w:pPr>
               <w:pStyle w:val="Compact"/>
-              <w:jc w:val="left"/>
             </w:pPr>
             <w:r>
               <w:t xml:space="preserve">Definición de funcionalidades para campañas y generación de constancias.</w:t>
@@ -674,10 +639,9 @@
         </w:tc>
       </w:tr>
     </w:tbl>
-    <w:bookmarkEnd w:id="22"/>
     <w:bookmarkEnd w:id="23"/>
     <w:bookmarkEnd w:id="24"/>
-    <w:bookmarkStart w:id="25" w:name="evidencia-visual-capturas-de-pantalla"/>
+    <w:bookmarkStart w:id="27" w:name="evidencia-visual-capturas-de-pantalla"/>
     <w:p>
       <w:pPr>
         <w:pStyle w:val="Heading1"/>
@@ -698,8 +662,54 @@
         <w:t xml:space="preserve">Falta de información. Pendiente de anexar capturas oficiales de las pantallas mostradas en esta sesión.</w:t>
       </w:r>
     </w:p>
-    <w:bookmarkEnd w:id="25"/>
-    <w:bookmarkStart w:id="26" w:name="estado-actual-del-proyecto"/>
+    <w:p>
+      <w:pPr>
+        <w:pStyle w:val="BodyText"/>
+      </w:pPr>
+      <w:r>
+        <w:rPr>
+          <w:b/>
+          <w:bCs/>
+        </w:rPr>
+        <w:t xml:space="preserve">Grabación de la sesión:</w:t>
+      </w:r>
+      <w:r>
+        <w:t xml:space="preserve"> </w:t>
+      </w:r>
+      <w:r>
+        <w:t xml:space="preserve">-</w:t>
+      </w:r>
+      <w:r>
+        <w:t xml:space="preserve"> </w:t>
+      </w:r>
+      <w:hyperlink r:id="rId25">
+        <w:r>
+          <w:rPr>
+            <w:rStyle w:val="Hyperlink"/>
+          </w:rPr>
+          <w:t xml:space="preserve">Video de la reunión (Google Drive)</w:t>
+        </w:r>
+      </w:hyperlink>
+      <w:r>
+        <w:t xml:space="preserve"> </w:t>
+      </w:r>
+      <w:r>
+        <w:t xml:space="preserve">-</w:t>
+      </w:r>
+      <w:r>
+        <w:t xml:space="preserve"> </w:t>
+      </w:r>
+      <w:hyperlink r:id="rId26">
+        <w:r>
+          <w:rPr>
+            <w:rStyle w:val="Hyperlink"/>
+          </w:rPr>
+          <w:t xml:space="preserve">Transcripción completa</w:t>
+        </w:r>
+      </w:hyperlink>
+    </w:p>
+    <w:bookmarkEnd w:id="27"/>
+    <w:bookmarkStart w:id="28" w:name="estado-actual-del-proyecto"/>
     <w:p>
       <w:pPr>
         <w:pStyle w:val="Heading1"/>
@@ -720,8 +730,8 @@
         <w:t xml:space="preserve">En Prototipado y Negociación. Se validó el prototipo funcional inicial y se acordó formalmente la liberación del servicio social a cambio de la entrega del sistema completo para diciembre de 2026.</w:t>
       </w:r>
     </w:p>
-    <w:bookmarkEnd w:id="26"/>
-    <w:bookmarkStart w:id="27" w:name="próximos-pasos"/>
+    <w:bookmarkEnd w:id="28"/>
+    <w:bookmarkStart w:id="29" w:name="próximos-pasos"/>
     <w:p>
       <w:pPr>
         <w:pStyle w:val="Heading1"/>
@@ -814,7 +824,7 @@
         <w:t xml:space="preserve">ABAQ — Reporte de Avance No. 1 · v1.0.0 · Agosto 2026</w:t>
       </w:r>
     </w:p>
-    <w:bookmarkEnd w:id="27"/>
+    <w:bookmarkEnd w:id="29"/>
     <w:sectPr>
       <w:footnotePr>
         <w:numRestart w:val="eachSect"/>

</xml_diff>